<commit_message>
release(retailcase): add local Oracle installer and publish product modules
Add a Windows setup entry point for official Oracle XE 21c, Python 3.13,
Node.js 22, empty RABAEV provisioning, minimal data and application startup.
Use encrypted local credentials, exact Oracle archive SHA-256 and
existing-database/port guards. No existing schema is dropped or overwritten.

Rename the current product, source paths and documentation to retailcase.
Retain pending operation IDs while migrating browser and desktop storage.
Update README with purpose, functional modules and installation commands.
Checkpoint the cosmetic minimax wave-name migration before live application.

Verified: architecture, 24 tooling tests, both TypeScript projects,
installer guards/PowerShell/DPAPI, storage migration and SQL bundle hashes.
A complete clean-Windows/XE installation rehearsal remains outstanding.
</commit_message>
<xml_diff>
--- a/wiki/requirements/retail_convenience_standard/docx/08_current_system_gap.docx
+++ b/wiki/requirements/retail_convenience_standard/docx/08_current_system_gap.docx
@@ -2115,7 +2115,7 @@
             <w:color w:val="215E86"/>
             <w:u w:val="single"/>
           </w:rPr>
-          <w:t>wiki/architecture/nikora_minimal_extension.md</w:t>
+          <w:t>wiki/architecture/retailcase_minimal_extension.md</w:t>
         </w:r>
       </w:hyperlink>
       <w:r>
@@ -2737,7 +2737,7 @@
           <w:sz w:val="22"/>
           <w:cs w:val="0"/>
         </w:rPr>
-        <w:t>Продуктовый код и Oracle этим документом не изменяются. Предыдущий пакет NIKORA сохраняет статус отдельного проектного профиля.</w:t>
+        <w:t>Продуктовый код и Oracle этим документом не изменяются. Предыдущий пакет RETAILCASE сохраняет статус отдельного проектного профиля.</w:t>
       </w:r>
     </w:p>
     <w:sectPr>

</xml_diff>